<commit_message>
report: fix section 5/8 to the final A20 numbers and hook description; regenerate pdf
</commit_message>
<xml_diff>
--- a/docs/report/技术报告-XLANG2026.docx
+++ b/docs/report/技术报告-XLANG2026.docx
@@ -2226,7 +2226,7 @@
           <w:color w:val="1F3B63"/>
           <w:sz w:val="30"/>
         </w:rPr>
-        <w:t>4. 天数 BI-V150：vendor FA 接入与发射配置重构（A1-A7）</w:t>
+        <w:t>4. 天数 BI-V150：vendor FA 接入、发射配置重构与自研 decode 内核（A1–A20）</w:t>
       </w:r>
     </w:p>
     <w:p>
@@ -6074,7 +6074,7 @@
           <w:rFonts w:ascii="宋体" w:hAnsi="宋体" w:eastAsia="宋体"/>
           <w:b w:val="0"/>
         </w:rPr>
-        <w:t xml:space="preserve"> attention 从 258 GB/s 提到 372 GB/s（4k +9.0%、16k +7.6%，同日 A/B），</w:t>
+        <w:t xml:space="preserve"> attention 从 258 GB/s 提到 372 GB/s（4k +9.4%、16k +15.6%，同日交错 A/B），</w:t>
       </w:r>
       <w:r>
         <w:rPr>
@@ -6901,7 +6901,47 @@
           <w:rFonts w:ascii="宋体" w:hAnsi="宋体" w:eastAsia="宋体"/>
           <w:b w:val="0"/>
         </w:rPr>
-        <w:t>：天数补丁（A1-A7，至 3f05c36d）</w:t>
+        <w:t>：天数补丁（A1–A7，至 3f05c36d）</w:t>
+      </w:r>
+    </w:p>
+    <w:p>
+      <w:pPr>
+        <w:pStyle w:val="ListBullet"/>
+      </w:pPr>
+      <w:r>
+        <w:rPr>
+          <w:rFonts w:ascii="宋体" w:hAnsi="宋体" w:eastAsia="宋体"/>
+          <w:b w:val="0"/>
+        </w:rPr>
+        <w:t>A20 自研 decode 内核 + 混合步 hook：</w:t>
+      </w:r>
+      <w:r>
+        <w:rPr>
+          <w:rFonts w:ascii="Consolas" w:hAnsi="Consolas" w:eastAsia="Consolas"/>
+          <w:b w:val="0"/>
+        </w:rPr>
+        <w:t>vllm-plugin-FL@84abed0</w:t>
+      </w:r>
+      <w:r>
+        <w:rPr>
+          <w:rFonts w:ascii="宋体" w:hAnsi="宋体" w:eastAsia="宋体"/>
+          <w:b w:val="0"/>
+        </w:rPr>
+        <w:t xml:space="preserve"> + </w:t>
+      </w:r>
+      <w:r>
+        <w:rPr>
+          <w:rFonts w:ascii="Consolas" w:hAnsi="Consolas" w:eastAsia="Consolas"/>
+          <w:b w:val="0"/>
+        </w:rPr>
+        <w:t>docs/experiments/a20/apply_a20.py</w:t>
+      </w:r>
+      <w:r>
+        <w:rPr>
+          <w:rFonts w:ascii="宋体" w:hAnsi="宋体" w:eastAsia="宋体"/>
+          <w:b w:val="0"/>
+        </w:rPr>
+        <w:t xml:space="preserve"> （干净 clone 应用后与线上三个文件字节一致）</w:t>
       </w:r>
     </w:p>
     <w:p>

</xml_diff>

<commit_message>
report: add auditable engagement evidence; regenerate pdf
</commit_message>
<xml_diff>
--- a/docs/report/技术报告-XLANG2026.docx
+++ b/docs/report/技术报告-XLANG2026.docx
@@ -5670,6 +5670,63 @@
           <w:rFonts w:ascii="宋体" w:hAnsi="宋体" w:eastAsia="宋体"/>
           <w:b/>
         </w:rPr>
+        <w:t>可审计性</w:t>
+      </w:r>
+      <w:r>
+        <w:rPr>
+          <w:rFonts w:ascii="宋体" w:hAnsi="宋体" w:eastAsia="宋体"/>
+          <w:b w:val="0"/>
+        </w:rPr>
+        <w:t>：混合步的 decode 切片每 4000 次调用打一行</w:t>
+      </w:r>
+    </w:p>
+    <w:p>
+      <w:pPr>
+        <w:spacing w:after="100"/>
+      </w:pPr>
+      <w:r>
+        <w:rPr>
+          <w:rFonts w:ascii="Consolas" w:hAnsi="Consolas" w:eastAsia="Consolas"/>
+          <w:b w:val="0"/>
+        </w:rPr>
+        <w:t>decode_attn_fast slice: used=X skipped=Y</w:t>
+      </w:r>
+      <w:r>
+        <w:rPr>
+          <w:rFonts w:ascii="宋体" w:hAnsi="宋体" w:eastAsia="宋体"/>
+          <w:b w:val="0"/>
+        </w:rPr>
+        <w:t>。16k 两次实测均为</w:t>
+      </w:r>
+    </w:p>
+    <w:p>
+      <w:pPr>
+        <w:spacing w:after="100"/>
+      </w:pPr>
+      <w:r>
+        <w:rPr>
+          <w:rFonts w:ascii="Consolas" w:hAnsi="Consolas" w:eastAsia="Consolas"/>
+          <w:b w:val="0"/>
+        </w:rPr>
+        <w:t>used=44000, skipped=0</w:t>
+      </w:r>
+      <w:r>
+        <w:rPr>
+          <w:rFonts w:ascii="宋体" w:hAnsi="宋体" w:eastAsia="宋体"/>
+          <w:b w:val="0"/>
+        </w:rPr>
+        <w:t>，即 decode 切片 100% 命中自研内核，不存在"偶尔退回 stock"。</w:t>
+      </w:r>
+    </w:p>
+    <w:p>
+      <w:pPr>
+        <w:spacing w:after="100"/>
+      </w:pPr>
+      <w:r>
+        <w:rPr>
+          <w:rFonts w:ascii="宋体" w:hAnsi="宋体" w:eastAsia="宋体"/>
+          <w:b/>
+        </w:rPr>
         <w:t>为什么停在 372 GB/s</w:t>
       </w:r>
       <w:r>

</xml_diff>

<commit_message>
A20: correct the prefill cost model with measured GPU split (gather 0.03-0.05ms vs FA 1.7-3.3ms, gather ~1.5%); prefill is FA-compute bound; regenerate report
</commit_message>
<xml_diff>
--- a/docs/report/技术报告-XLANG2026.docx
+++ b/docs/report/技术报告-XLANG2026.docx
@@ -6429,14 +6429,7 @@
           <w:rFonts w:ascii="宋体" w:hAnsi="宋体" w:eastAsia="宋体"/>
           <w:b w:val="0"/>
         </w:rPr>
-        <w:t xml:space="preserve"> 的逐层反分页 gather（16k 下约 22 GB 读 + 22 GB 写/波），但该 API 要求</w:t>
-      </w:r>
-      <w:r>
-        <w:rPr>
-          <w:rFonts w:ascii="宋体" w:hAnsi="宋体" w:eastAsia="宋体"/>
-          <w:b w:val="0"/>
-        </w:rPr>
-        <w:t xml:space="preserve"> cache 首维</w:t>
+        <w:t xml:space="preserve"> 的逐层反分页 gather，但该 API 要求 cache 首维</w:t>
       </w:r>
       <w:r>
         <w:rPr>
@@ -6450,7 +6443,14 @@
           <w:rFonts w:ascii="宋体" w:hAnsi="宋体" w:eastAsia="宋体"/>
           <w:b w:val="0"/>
         </w:rPr>
-        <w:t xml:space="preserve">等于 </w:t>
+        <w:t>等于</w:t>
+      </w:r>
+      <w:r>
+        <w:rPr>
+          <w:rFonts w:ascii="宋体" w:hAnsi="宋体" w:eastAsia="宋体"/>
+          <w:b w:val="0"/>
+        </w:rPr>
+        <w:t xml:space="preserve"> </w:t>
       </w:r>
       <w:r>
         <w:rPr>
@@ -6464,14 +6464,7 @@
           <w:rFonts w:ascii="宋体" w:hAnsi="宋体" w:eastAsia="宋体"/>
           <w:b w:val="0"/>
         </w:rPr>
-        <w:t>，与 vLLM 全局池</w:t>
-      </w:r>
-      <w:r>
-        <w:rPr>
-          <w:rFonts w:ascii="宋体" w:hAnsi="宋体" w:eastAsia="宋体"/>
-          <w:b w:val="0"/>
-        </w:rPr>
-        <w:t xml:space="preserve"> （32603 页）和 </w:t>
+        <w:t xml:space="preserve">，与 vLLM 全局池（32603 页）和 </w:t>
       </w:r>
       <w:r>
         <w:rPr>
@@ -6485,7 +6478,21 @@
           <w:rFonts w:ascii="宋体" w:hAnsi="宋体" w:eastAsia="宋体"/>
           <w:b w:val="0"/>
         </w:rPr>
-        <w:t xml:space="preserve"> 宽度（8192）不兼容；tensor-desc 路径直接</w:t>
+        <w:t xml:space="preserve"> 宽度（8192）不兼容；tensor-desc 路径直接 </w:t>
+      </w:r>
+      <w:r>
+        <w:rPr>
+          <w:rFonts w:ascii="Consolas" w:hAnsi="Consolas" w:eastAsia="Consolas"/>
+          <w:b w:val="0"/>
+        </w:rPr>
+        <w:t>CUINFER_STATUS_BAD_PARAM</w:t>
+      </w:r>
+      <w:r>
+        <w:rPr>
+          <w:rFonts w:ascii="宋体" w:hAnsi="宋体" w:eastAsia="宋体"/>
+          <w:b w:val="0"/>
+        </w:rPr>
+        <w:t>。</w:t>
       </w:r>
       <w:r>
         <w:rPr>
@@ -6496,17 +6503,45 @@
       </w:r>
       <w:r>
         <w:rPr>
-          <w:rFonts w:ascii="Consolas" w:hAnsi="Consolas" w:eastAsia="Consolas"/>
-          <w:b w:val="0"/>
-        </w:rPr>
-        <w:t>CUINFER_STATUS_BAD_PARAM</w:t>
-      </w:r>
-      <w:r>
-        <w:rPr>
-          <w:rFonts w:ascii="宋体" w:hAnsi="宋体" w:eastAsia="宋体"/>
-          <w:b w:val="0"/>
-        </w:rPr>
-        <w:t>。不可用。</w:t>
+          <w:rFonts w:ascii="宋体" w:hAnsi="宋体" w:eastAsia="宋体"/>
+          <w:b/>
+        </w:rPr>
+        <w:t>事后用 CUDA 事件更正了收益判断</w:t>
+      </w:r>
+      <w:r>
+        <w:rPr>
+          <w:rFonts w:ascii="宋体" w:hAnsi="宋体" w:eastAsia="宋体"/>
+          <w:b w:val="0"/>
+        </w:rPr>
+        <w:t>：gather 每次仅 0.03–0.05 ms，而 vendor FA</w:t>
+      </w:r>
+      <w:r>
+        <w:rPr>
+          <w:rFonts w:ascii="宋体" w:hAnsi="宋体" w:eastAsia="宋体"/>
+          <w:b w:val="0"/>
+        </w:rPr>
+        <w:t xml:space="preserve"> 每次 1.7–3.3 ms，gather 只占 prefill GPU 时间的 </w:t>
+      </w:r>
+      <w:r>
+        <w:rPr>
+          <w:rFonts w:ascii="宋体" w:hAnsi="宋体" w:eastAsia="宋体"/>
+          <w:b/>
+        </w:rPr>
+        <w:t>~1.5%</w:t>
+      </w:r>
+      <w:r>
+        <w:rPr>
+          <w:rFonts w:ascii="宋体" w:hAnsi="宋体" w:eastAsia="宋体"/>
+          <w:b w:val="0"/>
+        </w:rPr>
+        <w:t>——即便打通也只有</w:t>
+      </w:r>
+      <w:r>
+        <w:rPr>
+          <w:rFonts w:ascii="宋体" w:hAnsi="宋体" w:eastAsia="宋体"/>
+          <w:b w:val="0"/>
+        </w:rPr>
+        <w:t xml:space="preserve"> 1–2% 收益。16k 的 prefill 是 FA 计算受限（有效算力 ~115 TFLOPS，接近本卡上限）。</w:t>
       </w:r>
     </w:p>
     <w:p>

</xml_diff>

<commit_message>
A20 final accuracy: MATH-500 L3 98.1% on the delivered tree (FlagGems paged_decode_attention), regenerated report pdf
</commit_message>
<xml_diff>
--- a/docs/report/技术报告-XLANG2026.docx
+++ b/docs/report/技术报告-XLANG2026.docx
@@ -914,14 +914,14 @@
           <w:rFonts w:ascii="宋体" w:hAnsi="宋体" w:eastAsia="宋体"/>
           <w:b/>
         </w:rPr>
-        <w:t>97.1%</w:t>
-      </w:r>
-      <w:r>
-        <w:rPr>
-          <w:rFonts w:ascii="宋体" w:hAnsi="宋体" w:eastAsia="宋体"/>
-          <w:b w:val="0"/>
-        </w:rPr>
-        <w:t>（A20 最终代码实测两轮，A7 阶段为 98.1%）。</w:t>
+        <w:t>98.1%</w:t>
+      </w:r>
+      <w:r>
+        <w:rPr>
+          <w:rFonts w:ascii="宋体" w:hAnsi="宋体" w:eastAsia="宋体"/>
+          <w:b w:val="0"/>
+        </w:rPr>
+        <w:t>（最终交付树 2026-10-20 复核；10-18 同代码 97.1%）。</w:t>
       </w:r>
     </w:p>
     <w:p>
@@ -5632,21 +5632,21 @@
           <w:rFonts w:ascii="宋体" w:hAnsi="宋体" w:eastAsia="宋体"/>
           <w:b w:val="0"/>
         </w:rPr>
-        <w:t xml:space="preserve">精度：最终代码（含混合步路径）MATH-500 Level 3 = </w:t>
+        <w:t xml:space="preserve">精度：最终交付树（内核已迁入 FlagGems）MATH-500 Level 3 = </w:t>
       </w:r>
       <w:r>
         <w:rPr>
           <w:rFonts w:ascii="宋体" w:hAnsi="宋体" w:eastAsia="宋体"/>
           <w:b/>
         </w:rPr>
-        <w:t>97.1%</w:t>
-      </w:r>
-      <w:r>
-        <w:rPr>
-          <w:rFonts w:ascii="宋体" w:hAnsi="宋体" w:eastAsia="宋体"/>
-          <w:b w:val="0"/>
-        </w:rPr>
-        <w:t>（105 题），与不含</w:t>
+        <w:t>98.1%</w:t>
+      </w:r>
+      <w:r>
+        <w:rPr>
+          <w:rFonts w:ascii="宋体" w:hAnsi="宋体" w:eastAsia="宋体"/>
+          <w:b w:val="0"/>
+        </w:rPr>
+        <w:t>（105 题）；</w:t>
       </w:r>
     </w:p>
     <w:p>
@@ -5658,7 +5658,7 @@
           <w:rFonts w:ascii="宋体" w:hAnsi="宋体" w:eastAsia="宋体"/>
           <w:b w:val="0"/>
         </w:rPr>
-        <w:t>该路径时一致。</w:t>
+        <w:t>10-18 同代码复核为 97.1%，两次都在基线 96.2% 之上。</w:t>
       </w:r>
     </w:p>
     <w:p>

</xml_diff>

<commit_message>
A20: page-aligned segments in FlagGems op (-7..10%/layer, bit-identical); 4k +16.4% / 16k +19.8% same-day A/B; NaN pitfall documented
</commit_message>
<xml_diff>
--- a/docs/report/技术报告-XLANG2026.docx
+++ b/docs/report/技术报告-XLANG2026.docx
@@ -5452,30 +5452,7 @@
                 <w:b w:val="0"/>
                 <w:sz w:val="18"/>
               </w:rPr>
-              <w:t>2328.2（A1/A2/A5/B4 对照组中位）</w:t>
-            </w:r>
-          </w:p>
-        </w:tc>
-        <w:tc>
-          <w:tcPr>
-            <w:tcW w:type="dxa" w:w="2500"/>
-          </w:tcPr>
-          <w:p>
-            <w:pPr>
-              <w:spacing w:after="40" w:before="40"/>
-            </w:pPr>
-            <w:r>
-              <w:rPr>
-                <w:sz w:val="18"/>
-              </w:rPr>
-            </w:r>
-            <w:r>
-              <w:rPr>
-                <w:rFonts w:ascii="宋体" w:hAnsi="宋体" w:eastAsia="宋体"/>
-                <w:b w:val="0"/>
-                <w:sz w:val="18"/>
-              </w:rPr>
-              <w:t>2546.1（B1–B3/B10 中位）</w:t>
+              <w:t>2239.43（A6b）</w:t>
             </w:r>
           </w:p>
         </w:tc>
@@ -5498,7 +5475,7 @@
                 <w:b/>
                 <w:sz w:val="18"/>
               </w:rPr>
-              <w:t>+9.4%</w:t>
+              <w:t>2606.56</w:t>
             </w:r>
             <w:r>
               <w:rPr>
@@ -5506,7 +5483,38 @@
                 <w:b w:val="0"/>
                 <w:sz w:val="18"/>
               </w:rPr>
-              <w:t>，TPOT 111.9→98.6 ms，TTFT 持平</w:t>
+              <w:t>（B19，页对齐版）</w:t>
+            </w:r>
+          </w:p>
+        </w:tc>
+        <w:tc>
+          <w:tcPr>
+            <w:tcW w:type="dxa" w:w="2500"/>
+          </w:tcPr>
+          <w:p>
+            <w:pPr>
+              <w:spacing w:after="40" w:before="40"/>
+            </w:pPr>
+            <w:r>
+              <w:rPr>
+                <w:sz w:val="18"/>
+              </w:rPr>
+            </w:r>
+            <w:r>
+              <w:rPr>
+                <w:rFonts w:ascii="宋体" w:hAnsi="宋体" w:eastAsia="宋体"/>
+                <w:b/>
+                <w:sz w:val="18"/>
+              </w:rPr>
+              <w:t>+16.4%</w:t>
+            </w:r>
+            <w:r>
+              <w:rPr>
+                <w:rFonts w:ascii="宋体" w:hAnsi="宋体" w:eastAsia="宋体"/>
+                <w:b w:val="0"/>
+                <w:sz w:val="18"/>
+              </w:rPr>
+              <w:t>，TPOT 113.6→95.5 ms，TTFT −1.0%</w:t>
             </w:r>
           </w:p>
         </w:tc>
@@ -5562,30 +5570,7 @@
                 <w:b w:val="0"/>
                 <w:sz w:val="18"/>
               </w:rPr>
-              <w:t>2972.1（晚间交错 A3/A4）</w:t>
-            </w:r>
-          </w:p>
-        </w:tc>
-        <w:tc>
-          <w:tcPr>
-            <w:tcW w:type="dxa" w:w="2500"/>
-          </w:tcPr>
-          <w:p>
-            <w:pPr>
-              <w:spacing w:after="40" w:before="40"/>
-            </w:pPr>
-            <w:r>
-              <w:rPr>
-                <w:sz w:val="18"/>
-              </w:rPr>
-            </w:r>
-            <w:r>
-              <w:rPr>
-                <w:rFonts w:ascii="宋体" w:hAnsi="宋体" w:eastAsia="宋体"/>
-                <w:b w:val="0"/>
-                <w:sz w:val="18"/>
-              </w:rPr>
-              <w:t>3436.2（B8/B9）</w:t>
+              <w:t>2956.59（A7b）</w:t>
             </w:r>
           </w:p>
         </w:tc>
@@ -5608,7 +5593,7 @@
                 <w:b/>
                 <w:sz w:val="18"/>
               </w:rPr>
-              <w:t>+15.6%</w:t>
+              <w:t>3541.34</w:t>
             </w:r>
             <w:r>
               <w:rPr>
@@ -5616,7 +5601,38 @@
                 <w:b w:val="0"/>
                 <w:sz w:val="18"/>
               </w:rPr>
-              <w:t>，TTFT 155.1→134.0 s，TPOT 152.5→129.8 ms</w:t>
+              <w:t>（B20，页对齐版）</w:t>
+            </w:r>
+          </w:p>
+        </w:tc>
+        <w:tc>
+          <w:tcPr>
+            <w:tcW w:type="dxa" w:w="2500"/>
+          </w:tcPr>
+          <w:p>
+            <w:pPr>
+              <w:spacing w:after="40" w:before="40"/>
+            </w:pPr>
+            <w:r>
+              <w:rPr>
+                <w:sz w:val="18"/>
+              </w:rPr>
+            </w:r>
+            <w:r>
+              <w:rPr>
+                <w:rFonts w:ascii="宋体" w:hAnsi="宋体" w:eastAsia="宋体"/>
+                <w:b/>
+                <w:sz w:val="18"/>
+              </w:rPr>
+              <w:t>+19.8%</w:t>
+            </w:r>
+            <w:r>
+              <w:rPr>
+                <w:rFonts w:ascii="宋体" w:hAnsi="宋体" w:eastAsia="宋体"/>
+                <w:b w:val="0"/>
+                <w:sz w:val="18"/>
+              </w:rPr>
+              <w:t>，TTFT 155.5→130.1 s，TPOT 153.3→125.6 ms</w:t>
             </w:r>
           </w:p>
         </w:tc>

</xml_diff>

<commit_message>
A20 paged segmentation: greedy parity 4/5 identical (fp32 summation-order flips), MATH-500 across runs 96.2/97.1/98.1 all >=95; docs+report updated
</commit_message>
<xml_diff>
--- a/docs/report/技术报告-XLANG2026.docx
+++ b/docs/report/技术报告-XLANG2026.docx
@@ -914,14 +914,14 @@
           <w:rFonts w:ascii="宋体" w:hAnsi="宋体" w:eastAsia="宋体"/>
           <w:b/>
         </w:rPr>
-        <w:t>98.1%</w:t>
-      </w:r>
-      <w:r>
-        <w:rPr>
-          <w:rFonts w:ascii="宋体" w:hAnsi="宋体" w:eastAsia="宋体"/>
-          <w:b w:val="0"/>
-        </w:rPr>
-        <w:t>（最终交付树 2026-10-20 复核；10-18 同代码 97.1%）。</w:t>
+        <w:t>96.2~98.1%</w:t>
+      </w:r>
+      <w:r>
+        <w:rPr>
+          <w:rFonts w:ascii="宋体" w:hAnsi="宋体" w:eastAsia="宋体"/>
+          <w:b w:val="0"/>
+        </w:rPr>
+        <w:t>（三次复核，均 ≥95%，基线 96.2%）。</w:t>
       </w:r>
     </w:p>
     <w:p>
@@ -5648,21 +5648,21 @@
           <w:rFonts w:ascii="宋体" w:hAnsi="宋体" w:eastAsia="宋体"/>
           <w:b w:val="0"/>
         </w:rPr>
-        <w:t xml:space="preserve">精度：最终交付树（内核已迁入 FlagGems）MATH-500 Level 3 = </w:t>
+        <w:t xml:space="preserve">精度：MATH-500 Level 3 三次复核 </w:t>
       </w:r>
       <w:r>
         <w:rPr>
           <w:rFonts w:ascii="宋体" w:hAnsi="宋体" w:eastAsia="宋体"/>
           <w:b/>
         </w:rPr>
-        <w:t>98.1%</w:t>
-      </w:r>
-      <w:r>
-        <w:rPr>
-          <w:rFonts w:ascii="宋体" w:hAnsi="宋体" w:eastAsia="宋体"/>
-          <w:b w:val="0"/>
-        </w:rPr>
-        <w:t>（105 题）；</w:t>
+        <w:t>97.1% / 98.1% / 96.2%</w:t>
+      </w:r>
+      <w:r>
+        <w:rPr>
+          <w:rFonts w:ascii="宋体" w:hAnsi="宋体" w:eastAsia="宋体"/>
+          <w:b w:val="0"/>
+        </w:rPr>
+        <w:t>（105 题，基线 96.2%），</w:t>
       </w:r>
     </w:p>
     <w:p>
@@ -5674,7 +5674,19 @@
           <w:rFonts w:ascii="宋体" w:hAnsi="宋体" w:eastAsia="宋体"/>
           <w:b w:val="0"/>
         </w:rPr>
-        <w:t>10-18 同代码复核为 97.1%，两次都在基线 96.2% 之上。</w:t>
+        <w:t>均 ≥95%；跑间差异来自采样（temperature 1.0 未固定 seed）与段内 fp32 求和顺序的等价扰动</w:t>
+      </w:r>
+    </w:p>
+    <w:p>
+      <w:pPr>
+        <w:spacing w:after="100"/>
+      </w:pPr>
+      <w:r>
+        <w:rPr>
+          <w:rFonts w:ascii="宋体" w:hAnsi="宋体" w:eastAsia="宋体"/>
+          <w:b w:val="0"/>
+        </w:rPr>
+        <w:t>（页对齐与通用分段的 greedy 对拍 4/5 完全一致，第 5 条从 ~30 token 起换措辞）。</w:t>
       </w:r>
     </w:p>
     <w:p>

</xml_diff>

<commit_message>
A20 paged: fourth MATH-500 sample 97.1% (96.2 was the low end of sampling noise)
</commit_message>
<xml_diff>
--- a/docs/report/技术报告-XLANG2026.docx
+++ b/docs/report/技术报告-XLANG2026.docx
@@ -921,7 +921,7 @@
           <w:rFonts w:ascii="宋体" w:hAnsi="宋体" w:eastAsia="宋体"/>
           <w:b w:val="0"/>
         </w:rPr>
-        <w:t>（三次复核，均 ≥95%，基线 96.2%）。</w:t>
+        <w:t>（四次复核，均 ≥95%，基线 96.2%）。</w:t>
       </w:r>
     </w:p>
     <w:p>
@@ -5648,14 +5648,14 @@
           <w:rFonts w:ascii="宋体" w:hAnsi="宋体" w:eastAsia="宋体"/>
           <w:b w:val="0"/>
         </w:rPr>
-        <w:t xml:space="preserve">精度：MATH-500 Level 3 三次复核 </w:t>
+        <w:t xml:space="preserve">精度：MATH-500 Level 3 四次复核 </w:t>
       </w:r>
       <w:r>
         <w:rPr>
           <w:rFonts w:ascii="宋体" w:hAnsi="宋体" w:eastAsia="宋体"/>
           <w:b/>
         </w:rPr>
-        <w:t>97.1% / 98.1% / 96.2%</w:t>
+        <w:t>97.1% / 98.1% / 96.2% / 97.1%</w:t>
       </w:r>
       <w:r>
         <w:rPr>

</xml_diff>

<commit_message>
A20: correct the tensor-core claim with dumped Iluvatar asm (bf16 m16n16k16 exists; PV cost is the accumulator->operand layout conversion)
</commit_message>
<xml_diff>
--- a/docs/report/技术报告-XLANG2026.docx
+++ b/docs/report/技术报告-XLANG2026.docx
@@ -5762,21 +5762,7 @@
           <w:rFonts w:ascii="宋体" w:hAnsi="宋体" w:eastAsia="宋体"/>
           <w:b w:val="0"/>
         </w:rPr>
-        <w:t xml:space="preserve">：BI-V150 报 compute capability </w:t>
-      </w:r>
-      <w:r>
-        <w:rPr>
-          <w:rFonts w:ascii="宋体" w:hAnsi="宋体" w:eastAsia="宋体"/>
-          <w:b/>
-        </w:rPr>
-        <w:t>7.1</w:t>
-      </w:r>
-      <w:r>
-        <w:rPr>
-          <w:rFonts w:ascii="宋体" w:hAnsi="宋体" w:eastAsia="宋体"/>
-          <w:b w:val="0"/>
-        </w:rPr>
-        <w:t>（Volta 世代，</w:t>
+        <w:t>：把 Triton 编出的 Iluvatar 汇编 dump 出来可以看到，</w:t>
       </w:r>
     </w:p>
     <w:p>
@@ -5788,21 +5774,28 @@
           <w:rFonts w:ascii="宋体" w:hAnsi="宋体" w:eastAsia="宋体"/>
           <w:b w:val="0"/>
         </w:rPr>
-        <w:t>CUDA 10.2 工具链），只有 fp16 HMMA、</w:t>
+        <w:t>卡上</w:t>
       </w:r>
       <w:r>
         <w:rPr>
           <w:rFonts w:ascii="宋体" w:hAnsi="宋体" w:eastAsia="宋体"/>
           <w:b/>
         </w:rPr>
-        <w:t>没有 bf16 tensor core</w:t>
-      </w:r>
-      <w:r>
-        <w:rPr>
-          <w:rFonts w:ascii="宋体" w:hAnsi="宋体" w:eastAsia="宋体"/>
-          <w:b w:val="0"/>
-        </w:rPr>
-        <w:t>。因此 Triton 的</w:t>
+        <w:t xml:space="preserve">有 bf16 的 </w:t>
+      </w:r>
+      <w:r>
+        <w:rPr>
+          <w:rFonts w:ascii="Consolas" w:hAnsi="Consolas" w:eastAsia="Consolas"/>
+          <w:b/>
+        </w:rPr>
+        <w:t>ml_matrix_mad_f32_bf16_m16n16k16</w:t>
+      </w:r>
+      <w:r>
+        <w:rPr>
+          <w:rFonts w:ascii="宋体" w:hAnsi="宋体" w:eastAsia="宋体"/>
+          <w:b w:val="0"/>
+        </w:rPr>
+        <w:t>（fp32 累加），QK 与 PV 两个</w:t>
       </w:r>
     </w:p>
     <w:p>
@@ -5811,17 +5804,17 @@
       </w:pPr>
       <w:r>
         <w:rPr>
-          <w:rFonts w:ascii="Consolas" w:hAnsi="Consolas" w:eastAsia="Consolas"/>
-          <w:b w:val="0"/>
-        </w:rPr>
-        <w:t>tl.dot(bf16, bf16)</w:t>
-      </w:r>
-      <w:r>
-        <w:rPr>
-          <w:rFonts w:ascii="宋体" w:hAnsi="宋体" w:eastAsia="宋体"/>
-          <w:b w:val="0"/>
-        </w:rPr>
-        <w:t xml:space="preserve"> 必然经过 bf16→fp16 转换与 fp32 累加器→操作数的布局搬运，</w:t>
+          <w:rFonts w:ascii="宋体" w:hAnsi="宋体" w:eastAsia="宋体"/>
+          <w:b w:val="0"/>
+        </w:rPr>
+        <w:t xml:space="preserve">dot 都落在它上面；代价不在算力，而在 </w:t>
+      </w:r>
+      <w:r>
+        <w:rPr>
+          <w:rFonts w:ascii="宋体" w:hAnsi="宋体" w:eastAsia="宋体"/>
+          <w:b/>
+        </w:rPr>
+        <w:t>MMA 累加器布局 → 点积操作数布局的转换</w:t>
       </w:r>
     </w:p>
     <w:p>
@@ -5833,7 +5826,21 @@
           <w:rFonts w:ascii="宋体" w:hAnsi="宋体" w:eastAsia="宋体"/>
           <w:b w:val="0"/>
         </w:rPr>
-        <w:t>PV 那 0.19 ms/层 就是它。实测把 K/V 换成 fp16 并不更快（0.699 vs 0.698 ms/层），</w:t>
+        <w:t xml:space="preserve">（TTGIR 里是一条 </w:t>
+      </w:r>
+      <w:r>
+        <w:rPr>
+          <w:rFonts w:ascii="Consolas" w:hAnsi="Consolas" w:eastAsia="Consolas"/>
+          <w:b w:val="0"/>
+        </w:rPr>
+        <w:t>ttg.convert_layout : #mma -&gt; #ttg.dot_op</w:t>
+      </w:r>
+      <w:r>
+        <w:rPr>
+          <w:rFonts w:ascii="宋体" w:hAnsi="宋体" w:eastAsia="宋体"/>
+          <w:b w:val="0"/>
+        </w:rPr>
+        <w:t>，汇编里展开成</w:t>
       </w:r>
     </w:p>
     <w:p>
@@ -5842,10 +5849,116 @@
       </w:pPr>
       <w:r>
         <w:rPr>
-          <w:rFonts w:ascii="宋体" w:hAnsi="宋体" w:eastAsia="宋体"/>
-          <w:b w:val="0"/>
-        </w:rPr>
-        <w:t>确认瓶颈不在 dtype 转换本身，而在 MMA 前后的布局搬运。</w:t>
+          <w:rFonts w:ascii="Consolas" w:hAnsi="Consolas" w:eastAsia="Consolas"/>
+          <w:b w:val="0"/>
+        </w:rPr>
+        <w:t>ml_lsa_blkload_x1</w:t>
+      </w:r>
+      <w:r>
+        <w:rPr>
+          <w:rFonts w:ascii="宋体" w:hAnsi="宋体" w:eastAsia="宋体"/>
+          <w:b w:val="0"/>
+        </w:rPr>
+        <w:t xml:space="preserve">×72 / </w:t>
+      </w:r>
+      <w:r>
+        <w:rPr>
+          <w:rFonts w:ascii="Consolas" w:hAnsi="Consolas" w:eastAsia="Consolas"/>
+          <w:b w:val="0"/>
+        </w:rPr>
+        <w:t>ml_slb_load_b32x1</w:t>
+      </w:r>
+      <w:r>
+        <w:rPr>
+          <w:rFonts w:ascii="宋体" w:hAnsi="宋体" w:eastAsia="宋体"/>
+          <w:b w:val="0"/>
+        </w:rPr>
+        <w:t xml:space="preserve">×48 / </w:t>
+      </w:r>
+      <w:r>
+        <w:rPr>
+          <w:rFonts w:ascii="Consolas" w:hAnsi="Consolas" w:eastAsia="Consolas"/>
+          <w:b w:val="0"/>
+        </w:rPr>
+        <w:t>ml_lsa_store_a64_dword</w:t>
+      </w:r>
+      <w:r>
+        <w:rPr>
+          <w:rFonts w:ascii="宋体" w:hAnsi="宋体" w:eastAsia="宋体"/>
+          <w:b w:val="0"/>
+        </w:rPr>
+        <w:t>×32 /</w:t>
+      </w:r>
+    </w:p>
+    <w:p>
+      <w:pPr>
+        <w:spacing w:after="100"/>
+      </w:pPr>
+      <w:r>
+        <w:rPr>
+          <w:rFonts w:ascii="Consolas" w:hAnsi="Consolas" w:eastAsia="Consolas"/>
+          <w:b w:val="0"/>
+        </w:rPr>
+        <w:t>ml_slb_shuffle_rtn_b32</w:t>
+      </w:r>
+      <w:r>
+        <w:rPr>
+          <w:rFonts w:ascii="宋体" w:hAnsi="宋体" w:eastAsia="宋体"/>
+          <w:b w:val="0"/>
+        </w:rPr>
+        <w:t xml:space="preserve">×22 / </w:t>
+      </w:r>
+      <w:r>
+        <w:rPr>
+          <w:rFonts w:ascii="Consolas" w:hAnsi="Consolas" w:eastAsia="Consolas"/>
+          <w:b w:val="0"/>
+        </w:rPr>
+        <w:t>ml_byte_permute_b32</w:t>
+      </w:r>
+      <w:r>
+        <w:rPr>
+          <w:rFonts w:ascii="宋体" w:hAnsi="宋体" w:eastAsia="宋体"/>
+          <w:b w:val="0"/>
+        </w:rPr>
+        <w:t xml:space="preserve">×25 与 6 处 </w:t>
+      </w:r>
+      <w:r>
+        <w:rPr>
+          <w:rFonts w:ascii="Consolas" w:hAnsi="Consolas" w:eastAsia="Consolas"/>
+          <w:b w:val="0"/>
+        </w:rPr>
+        <w:t>sl_barrier</w:t>
+      </w:r>
+      <w:r>
+        <w:rPr>
+          <w:rFonts w:ascii="宋体" w:hAnsi="宋体" w:eastAsia="宋体"/>
+          <w:b w:val="0"/>
+        </w:rPr>
+        <w:t>）。</w:t>
+      </w:r>
+    </w:p>
+    <w:p>
+      <w:pPr>
+        <w:spacing w:after="100"/>
+      </w:pPr>
+      <w:r>
+        <w:rPr>
+          <w:rFonts w:ascii="宋体" w:hAnsi="宋体" w:eastAsia="宋体"/>
+          <w:b w:val="0"/>
+        </w:rPr>
+        <w:t>实测把 K/V 换成 fp16 并不更快（0.699 vs 0.698 ms/层），确认瓶颈不在 dtype，</w:t>
+      </w:r>
+    </w:p>
+    <w:p>
+      <w:pPr>
+        <w:spacing w:after="100"/>
+      </w:pPr>
+      <w:r>
+        <w:rPr>
+          <w:rFonts w:ascii="宋体" w:hAnsi="宋体" w:eastAsia="宋体"/>
+          <w:b w:val="0"/>
+        </w:rPr>
+        <w:t>而在 MMA 前后的布局搬运。</w:t>
       </w:r>
     </w:p>
     <w:p>

</xml_diff>

<commit_message>
A21 rejected: IR-level fused RMSNorm is 2.5-7.2x faster in isolation but -5.9% in-engine (opaque custom op blocks inductor fusion, TTFT 2x); reverted, artifacts archived
</commit_message>
<xml_diff>
--- a/docs/report/技术报告-XLANG2026.docx
+++ b/docs/report/技术报告-XLANG2026.docx
@@ -6694,6 +6694,74 @@
           <w:rFonts w:ascii="宋体" w:hAnsi="宋体" w:eastAsia="宋体"/>
           <w:b/>
         </w:rPr>
+        <w:t>A21-IR-RMSNorm</w:t>
+      </w:r>
+      <w:r>
+        <w:rPr>
+          <w:rFonts w:ascii="宋体" w:hAnsi="宋体" w:eastAsia="宋体"/>
+          <w:b w:val="0"/>
+        </w:rPr>
+        <w:t>：把 RMSNorm 从 vLLM 的 IR "native"（纯 torch 链）换成自研 Triton 融合核，</w:t>
+      </w:r>
+      <w:r>
+        <w:rPr>
+          <w:rFonts w:ascii="宋体" w:hAnsi="宋体" w:eastAsia="宋体"/>
+          <w:b w:val="0"/>
+        </w:rPr>
+        <w:t xml:space="preserve"> 隔离里逐位一致且 2.5–7.2x（N=64: 132.8→54.0 µs；N=8192: 2039→281 µs），但引擎内 </w:t>
+      </w:r>
+      <w:r>
+        <w:rPr>
+          <w:rFonts w:ascii="宋体" w:hAnsi="宋体" w:eastAsia="宋体"/>
+          <w:b/>
+        </w:rPr>
+        <w:t>−5.9%</w:t>
+      </w:r>
+      <w:r>
+        <w:rPr>
+          <w:rFonts w:ascii="宋体" w:hAnsi="宋体" w:eastAsia="宋体"/>
+          <w:b w:val="0"/>
+        </w:rPr>
+        <w:t>、</w:t>
+      </w:r>
+      <w:r>
+        <w:rPr>
+          <w:rFonts w:ascii="宋体" w:hAnsi="宋体" w:eastAsia="宋体"/>
+          <w:b w:val="0"/>
+        </w:rPr>
+        <w:t xml:space="preserve"> TTFT 翻倍。原因：IR op 在编译期被 inline，核只能包成 opaque </w:t>
+      </w:r>
+      <w:r>
+        <w:rPr>
+          <w:rFonts w:ascii="Consolas" w:hAnsi="Consolas" w:eastAsia="Consolas"/>
+          <w:b w:val="0"/>
+        </w:rPr>
+        <w:t>torch.library.custom_op</w:t>
+      </w:r>
+      <w:r>
+        <w:rPr>
+          <w:rFonts w:ascii="宋体" w:hAnsi="宋体" w:eastAsia="宋体"/>
+          <w:b w:val="0"/>
+        </w:rPr>
+        <w:t>，</w:t>
+      </w:r>
+      <w:r>
+        <w:rPr>
+          <w:rFonts w:ascii="宋体" w:hAnsi="宋体" w:eastAsia="宋体"/>
+          <w:b w:val="0"/>
+        </w:rPr>
+        <w:t xml:space="preserve"> inductor 因此失去对相邻算子的融合（prefill 最敏感）。已回退。</w:t>
+      </w:r>
+    </w:p>
+    <w:p>
+      <w:pPr>
+        <w:pStyle w:val="ListBullet"/>
+      </w:pPr>
+      <w:r>
+        <w:rPr>
+          <w:rFonts w:ascii="宋体" w:hAnsi="宋体" w:eastAsia="宋体"/>
+          <w:b/>
+        </w:rPr>
         <w:t>量化</w:t>
       </w:r>
       <w:r>

</xml_diff>

<commit_message>
A20: batch-invariance property documented + FlagGems test (9 passed on BI-V150); report updated
</commit_message>
<xml_diff>
--- a/docs/report/技术报告-XLANG2026.docx
+++ b/docs/report/技术报告-XLANG2026.docx
@@ -5698,6 +5698,110 @@
           <w:rFonts w:ascii="宋体" w:hAnsi="宋体" w:eastAsia="宋体"/>
           <w:b/>
         </w:rPr>
+        <w:t>批量不变性（可复现性）</w:t>
+      </w:r>
+      <w:r>
+        <w:rPr>
+          <w:rFonts w:ascii="宋体" w:hAnsi="宋体" w:eastAsia="宋体"/>
+          <w:b w:val="0"/>
+        </w:rPr>
+        <w:t>：内核每个 (seq, kv_head, segment) 只依赖自己的 q / KV 页 /</w:t>
+      </w:r>
+    </w:p>
+    <w:p>
+      <w:pPr>
+        <w:spacing w:after="100"/>
+      </w:pPr>
+      <w:r>
+        <w:rPr>
+          <w:rFonts w:ascii="Consolas" w:hAnsi="Consolas" w:eastAsia="Consolas"/>
+          <w:b w:val="0"/>
+        </w:rPr>
+        <w:t>seq_lens</w:t>
+      </w:r>
+      <w:r>
+        <w:rPr>
+          <w:rFonts w:ascii="宋体" w:hAnsi="宋体" w:eastAsia="宋体"/>
+          <w:b w:val="0"/>
+        </w:rPr>
+        <w:t>，段长只由该序列长度决定，因此</w:t>
+      </w:r>
+      <w:r>
+        <w:rPr>
+          <w:rFonts w:ascii="宋体" w:hAnsi="宋体" w:eastAsia="宋体"/>
+          <w:b/>
+        </w:rPr>
+        <w:t>同一序列的输出与批组成无关</w:t>
+      </w:r>
+      <w:r>
+        <w:rPr>
+          <w:rFonts w:ascii="宋体" w:hAnsi="宋体" w:eastAsia="宋体"/>
+          <w:b w:val="0"/>
+        </w:rPr>
+        <w:t>。FlagGems 侧已配测试</w:t>
+      </w:r>
+    </w:p>
+    <w:p>
+      <w:pPr>
+        <w:spacing w:after="100"/>
+      </w:pPr>
+      <w:r>
+        <w:rPr>
+          <w:rFonts w:ascii="宋体" w:hAnsi="宋体" w:eastAsia="宋体"/>
+          <w:b w:val="0"/>
+        </w:rPr>
+        <w:t>（</w:t>
+      </w:r>
+      <w:r>
+        <w:rPr>
+          <w:rFonts w:ascii="Consolas" w:hAnsi="Consolas" w:eastAsia="Consolas"/>
+          <w:b w:val="0"/>
+        </w:rPr>
+        <w:t>tests/test_paged_decode_attention.py</w:t>
+      </w:r>
+      <w:r>
+        <w:rPr>
+          <w:rFonts w:ascii="宋体" w:hAnsi="宋体" w:eastAsia="宋体"/>
+          <w:b w:val="0"/>
+        </w:rPr>
+        <w:t>）：8 个精度用例对照 fp32 参考，外加一个批量不变性用例</w:t>
+      </w:r>
+    </w:p>
+    <w:p>
+      <w:pPr>
+        <w:spacing w:after="100"/>
+      </w:pPr>
+      <w:r>
+        <w:rPr>
+          <w:rFonts w:ascii="宋体" w:hAnsi="宋体" w:eastAsia="宋体"/>
+          <w:b w:val="0"/>
+        </w:rPr>
+        <w:t xml:space="preserve">（单条 / 两条 / 半批 / 全批 / 逆序全批，逐位相等 + 重复同组成验证确定性），BI-V150 上 </w:t>
+      </w:r>
+      <w:r>
+        <w:rPr>
+          <w:rFonts w:ascii="Consolas" w:hAnsi="Consolas" w:eastAsia="Consolas"/>
+          <w:b w:val="0"/>
+        </w:rPr>
+        <w:t>9 passed</w:t>
+      </w:r>
+      <w:r>
+        <w:rPr>
+          <w:rFonts w:ascii="宋体" w:hAnsi="宋体" w:eastAsia="宋体"/>
+          <w:b w:val="0"/>
+        </w:rPr>
+        <w:t>。</w:t>
+      </w:r>
+    </w:p>
+    <w:p>
+      <w:pPr>
+        <w:spacing w:after="100"/>
+      </w:pPr>
+      <w:r>
+        <w:rPr>
+          <w:rFonts w:ascii="宋体" w:hAnsi="宋体" w:eastAsia="宋体"/>
+          <w:b/>
+        </w:rPr>
         <w:t>可审计性</w:t>
       </w:r>
       <w:r>

</xml_diff>

<commit_message>
A22 rejected: W8 int8 weights are 1.86x in the isolated upper bound but 0.77x in the real path (per-call act quantization + dequant epilogue cost ~80us vs a 115us gate_up GEMM); prototype removed, artifacts archived
</commit_message>
<xml_diff>
--- a/docs/report/技术报告-XLANG2026.docx
+++ b/docs/report/技术报告-XLANG2026.docx
@@ -6866,6 +6866,74 @@
           <w:rFonts w:ascii="宋体" w:hAnsi="宋体" w:eastAsia="宋体"/>
           <w:b/>
         </w:rPr>
+        <w:t>A22-W8 权重</w:t>
+      </w:r>
+      <w:r>
+        <w:rPr>
+          <w:rFonts w:ascii="宋体" w:hAnsi="宋体" w:eastAsia="宋体"/>
+          <w:b w:val="0"/>
+        </w:rPr>
+        <w:t xml:space="preserve">：int8 权重量化 + 厂商 </w:t>
+      </w:r>
+      <w:r>
+        <w:rPr>
+          <w:rFonts w:ascii="Consolas" w:hAnsi="Consolas" w:eastAsia="Consolas"/>
+          <w:b w:val="0"/>
+        </w:rPr>
+        <w:t>torch._int_mm</w:t>
+      </w:r>
+      <w:r>
+        <w:rPr>
+          <w:rFonts w:ascii="宋体" w:hAnsi="宋体" w:eastAsia="宋体"/>
+          <w:b w:val="0"/>
+        </w:rPr>
+        <w:t>。上界可观（gate_up+SwiGLU 在"激活已量化 +</w:t>
+      </w:r>
+      <w:r>
+        <w:rPr>
+          <w:rFonts w:ascii="宋体" w:hAnsi="宋体" w:eastAsia="宋体"/>
+          <w:b w:val="0"/>
+        </w:rPr>
+        <w:t xml:space="preserve"> 融合 epilogue"的假设下 137.5→73.8 µs，1.86x），但真实集成必须每步付"激活量化 + 反量化"两个小核</w:t>
+      </w:r>
+      <w:r>
+        <w:rPr>
+          <w:rFonts w:ascii="宋体" w:hAnsi="宋体" w:eastAsia="宋体"/>
+          <w:b w:val="0"/>
+        </w:rPr>
+        <w:t xml:space="preserve"> （合计约 80 µs），而 gate_up 的 bf16 GEMM 只有 115–121 µs → </w:t>
+      </w:r>
+      <w:r>
+        <w:rPr>
+          <w:rFonts w:ascii="宋体" w:hAnsi="宋体" w:eastAsia="宋体"/>
+          <w:b/>
+        </w:rPr>
+        <w:t>实测 0.77x（净亏）</w:t>
+      </w:r>
+      <w:r>
+        <w:rPr>
+          <w:rFonts w:ascii="宋体" w:hAnsi="宋体" w:eastAsia="宋体"/>
+          <w:b w:val="0"/>
+        </w:rPr>
+        <w:t>。</w:t>
+      </w:r>
+      <w:r>
+        <w:rPr>
+          <w:rFonts w:ascii="宋体" w:hAnsi="宋体" w:eastAsia="宋体"/>
+          <w:b w:val="0"/>
+        </w:rPr>
+        <w:t xml:space="preserve"> 要藏掉这笔开销只能自写融合 int8 GEMM，而本卡 Triton matmul 比厂商慢约 6 倍。否决。</w:t>
+      </w:r>
+    </w:p>
+    <w:p>
+      <w:pPr>
+        <w:pStyle w:val="ListBullet"/>
+      </w:pPr>
+      <w:r>
+        <w:rPr>
+          <w:rFonts w:ascii="宋体" w:hAnsi="宋体" w:eastAsia="宋体"/>
+          <w:b/>
+        </w:rPr>
         <w:t>量化</w:t>
       </w:r>
       <w:r>

</xml_diff>